<commit_message>
docs: move SQLite teaching and assessment to Worksheet 7
Keep Worksheet 6 focused on JSON assets and saved preferences. Draft the SQLite progression for Demo 4 and align assessment sources and application CI.

Co-authored-by: Copilot <223556219+Copilot@users.noreply.github.com>
</commit_message>
<xml_diff>
--- a/assessment_guide.docx
+++ b/assessment_guide.docx
@@ -428,6 +428,16 @@
           <w:lang w:val="en-US"/>
         </w:rPr>
         <w:t xml:space="preserve">Understanding is worth 8%: you answer two questions about your own code and the decisions behind it. </w:t>
+      </w:r>
+    </w:p>
+    <w:p>
+      <w:r>
+        <w:t>Demo 3 covers Worksheets 5 and 6: themed navigation, the ticket basket, profile forms, a JSON film catalogue and saved profile preferences. SQLite booking history and database-backed checkout begin in Worksheet 7 for Demo 4, not required for Demo 3. Provider and notifiers are not assessment requirements.</w:t>
+      </w:r>
+    </w:p>
+    <w:p>
+      <w:r>
+        <w:t>From Demo 4 onwards, test folders must mirror the application folders under lib. Run flutter test --coverage and demonstrate the results with the Flutter Coverage extension in VS Code. Test database queries, booking history and checkout success and failure, and verify that completed bookings survive restarting the Android emulator app.</w:t>
       </w:r>
     </w:p>
     <w:p>

</xml_diff>